<commit_message>
uploaded the meeting minutes
</commit_message>
<xml_diff>
--- a/CISC7204-Assgn02-PairXX-RevisedProjectProposal.docx
+++ b/CISC7204-Assgn02-PairXX-RevisedProjectProposal.docx
@@ -88,15 +88,7 @@
           <w:b/>
           <w:sz w:val="24"/>
         </w:rPr>
-        <w:t>2</w:t>
-      </w:r>
-      <w:r>
-        <w:rPr>
-          <w:rFonts w:ascii="Times New Roman" w:hAnsi="Times New Roman" w:cs="Times New Roman"/>
-          <w:b/>
-          <w:sz w:val="24"/>
-        </w:rPr>
-        <w:t xml:space="preserve"> - </w:t>
+        <w:t xml:space="preserve">2 - </w:t>
       </w:r>
       <w:r>
         <w:rPr>
@@ -1281,25 +1273,7 @@
           <w:i w:val="0"/>
           <w:iCs w:val="0"/>
         </w:rPr>
-        <w:t>Figure 3</w:t>
-      </w:r>
-      <w:r>
-        <w:rPr>
-          <w:rStyle w:val="Emphasis"/>
-          <w:rFonts w:ascii="Times New Roman" w:hAnsi="Times New Roman" w:cs="Times New Roman"/>
-          <w:i w:val="0"/>
-          <w:iCs w:val="0"/>
-        </w:rPr>
-        <w:t xml:space="preserve"> (F3)</w:t>
-      </w:r>
-      <w:r>
-        <w:rPr>
-          <w:rStyle w:val="Emphasis"/>
-          <w:rFonts w:ascii="Times New Roman" w:hAnsi="Times New Roman" w:cs="Times New Roman"/>
-          <w:i w:val="0"/>
-          <w:iCs w:val="0"/>
-        </w:rPr>
-        <w:t>: Married versus separated adults by decade.</w:t>
+        <w:t>Figure 3 (F3): Married versus separated adults by decade.</w:t>
       </w:r>
       <w:r>
         <w:rPr>
@@ -1545,21 +1519,7 @@
           <w:rFonts w:ascii="Times New Roman" w:eastAsia="Times New Roman" w:hAnsi="Times New Roman" w:cs="Times New Roman"/>
           <w:lang w:val="en-GB" w:eastAsia="en-GB"/>
         </w:rPr>
-        <w:t xml:space="preserve">Extend our Assignment 01 work on income and happiness to a second possible source of </w:t>
-      </w:r>
-      <w:r>
-        <w:rPr>
-          <w:rFonts w:ascii="Times New Roman" w:eastAsia="Times New Roman" w:hAnsi="Times New Roman" w:cs="Times New Roman"/>
-          <w:lang w:val="en-GB" w:eastAsia="en-GB"/>
-        </w:rPr>
-        <w:t>happiness and</w:t>
-      </w:r>
-      <w:r>
-        <w:rPr>
-          <w:rFonts w:ascii="Times New Roman" w:eastAsia="Times New Roman" w:hAnsi="Times New Roman" w:cs="Times New Roman"/>
-          <w:lang w:val="en-GB" w:eastAsia="en-GB"/>
-        </w:rPr>
-        <w:t xml:space="preserve"> gain experience relevant to future study or careers in social-science research, data analysis and data-driven storytelling.</w:t>
+        <w:t>Extend our Assignment 01 work on income and happiness to a second possible source of happiness and gain experience relevant to future study or careers in social-science research, data analysis and data-driven storytelling.</w:t>
       </w:r>
     </w:p>
     <w:p>
@@ -1842,43 +1802,7 @@
           <w:szCs w:val="24"/>
           <w:lang w:val="en-GB" w:eastAsia="en-GB"/>
         </w:rPr>
-        <w:t xml:space="preserve">Keep valid </w:t>
-      </w:r>
-      <w:r>
-        <w:rPr>
-          <w:rFonts w:ascii="Times New Roman" w:eastAsia="Times New Roman" w:hAnsi="Times New Roman" w:cs="Times New Roman"/>
-          <w:sz w:val="24"/>
-          <w:szCs w:val="24"/>
-          <w:lang w:val="en-GB" w:eastAsia="en-GB"/>
-        </w:rPr>
-        <w:t>happy</w:t>
-      </w:r>
-      <w:r>
-        <w:rPr>
-          <w:rFonts w:ascii="Times New Roman" w:eastAsia="Times New Roman" w:hAnsi="Times New Roman" w:cs="Times New Roman"/>
-          <w:sz w:val="24"/>
-          <w:szCs w:val="24"/>
-          <w:lang w:val="en-GB" w:eastAsia="en-GB"/>
-        </w:rPr>
-        <w:t xml:space="preserve"> answers and the five </w:t>
-      </w:r>
-      <w:r>
-        <w:rPr>
-          <w:rFonts w:ascii="Times New Roman" w:eastAsia="Times New Roman" w:hAnsi="Times New Roman" w:cs="Times New Roman"/>
-          <w:sz w:val="24"/>
-          <w:szCs w:val="24"/>
-          <w:lang w:val="en-GB" w:eastAsia="en-GB"/>
-        </w:rPr>
-        <w:t>marital</w:t>
-      </w:r>
-      <w:r>
-        <w:rPr>
-          <w:rFonts w:ascii="Times New Roman" w:eastAsia="Times New Roman" w:hAnsi="Times New Roman" w:cs="Times New Roman"/>
-          <w:sz w:val="24"/>
-          <w:szCs w:val="24"/>
-          <w:lang w:val="en-GB" w:eastAsia="en-GB"/>
-        </w:rPr>
-        <w:t xml:space="preserve"> codes (married, widowed, divorced, separated, never married).</w:t>
+        <w:t>Keep valid happy answers and the five marital codes (married, widowed, divorced, separated, never married).</w:t>
       </w:r>
     </w:p>
     <w:p>
@@ -2250,14 +2174,7 @@
           <w:rFonts w:ascii="Times New Roman" w:hAnsi="Times New Roman" w:cs="Times New Roman"/>
           <w:color w:val="000000" w:themeColor="text1"/>
         </w:rPr>
-        <w:t xml:space="preserve">: </w:t>
-      </w:r>
-      <w:r>
-        <w:rPr>
-          <w:rFonts w:ascii="Times New Roman" w:hAnsi="Times New Roman" w:cs="Times New Roman"/>
-          <w:color w:val="000000" w:themeColor="text1"/>
-        </w:rPr>
-        <w:t>Every statistic in this document can be reproduced by running the submitted notebook on the stated public sources.</w:t>
+        <w:t>: Every statistic in this document can be reproduced by running the submitted notebook on the stated public sources.</w:t>
       </w:r>
     </w:p>
     <w:p>
@@ -2437,7 +2354,14 @@
           <w:rFonts w:ascii="Times New Roman" w:hAnsi="Times New Roman" w:cs="Times New Roman"/>
           <w:color w:val="000000" w:themeColor="text1"/>
         </w:rPr>
-        <w:t xml:space="preserve">Kelden Jamtsho (mc66418) </w:t>
+        <w:t xml:space="preserve">KELDEN JAMTSHO </w:t>
+      </w:r>
+      <w:r>
+        <w:rPr>
+          <w:rFonts w:ascii="Times New Roman" w:hAnsi="Times New Roman" w:cs="Times New Roman"/>
+          <w:color w:val="000000" w:themeColor="text1"/>
+        </w:rPr>
+        <w:t xml:space="preserve">(mc66418) </w:t>
       </w:r>
       <w:r>
         <w:rPr>
@@ -2768,14 +2692,7 @@
           <w:rFonts w:ascii="Times New Roman" w:hAnsi="Times New Roman" w:cs="Times New Roman"/>
           <w:color w:val="000000" w:themeColor="text1"/>
         </w:rPr>
-        <w:t xml:space="preserve">10. </w:t>
-      </w:r>
-      <w:r>
-        <w:rPr>
-          <w:rFonts w:ascii="Times New Roman" w:hAnsi="Times New Roman" w:cs="Times New Roman"/>
-          <w:color w:val="000000" w:themeColor="text1"/>
-        </w:rPr>
-        <w:t xml:space="preserve">Declaration of AI Usage </w:t>
+        <w:t xml:space="preserve">10. Declaration of AI Usage </w:t>
       </w:r>
     </w:p>
     <w:p/>
@@ -2885,14 +2802,7 @@
           <w:rFonts w:ascii="Times New Roman" w:hAnsi="Times New Roman" w:cs="Times New Roman"/>
           <w:color w:val="000000" w:themeColor="text1"/>
         </w:rPr>
-        <w:t xml:space="preserve">11. </w:t>
-      </w:r>
-      <w:r>
-        <w:rPr>
-          <w:rFonts w:ascii="Times New Roman" w:hAnsi="Times New Roman" w:cs="Times New Roman"/>
-          <w:color w:val="000000" w:themeColor="text1"/>
-        </w:rPr>
-        <w:t>GitHub link for the Project Ideation and Project Proposal</w:t>
+        <w:t>11. GitHub link for the Project Ideation and Project Proposal</w:t>
       </w:r>
     </w:p>
     <w:p>
@@ -2919,51 +2829,7 @@
             <w:sz w:val="22"/>
             <w:szCs w:val="22"/>
           </w:rPr>
-          <w:t>htt</w:t>
-        </w:r>
-        <w:r>
-          <w:rPr>
-            <w:rStyle w:val="Hyperlink"/>
-            <w:rFonts w:ascii="Calibri" w:eastAsiaTheme="minorEastAsia" w:hAnsi="Calibri" w:cstheme="minorBidi"/>
-            <w:b w:val="0"/>
-            <w:bCs w:val="0"/>
-            <w:sz w:val="22"/>
-            <w:szCs w:val="22"/>
-          </w:rPr>
-          <w:t>p</w:t>
-        </w:r>
-        <w:r>
-          <w:rPr>
-            <w:rStyle w:val="Hyperlink"/>
-            <w:rFonts w:ascii="Calibri" w:eastAsiaTheme="minorEastAsia" w:hAnsi="Calibri" w:cstheme="minorBidi"/>
-            <w:b w:val="0"/>
-            <w:bCs w:val="0"/>
-            <w:sz w:val="22"/>
-            <w:szCs w:val="22"/>
-          </w:rPr>
-          <w:t>s://github.com/UNCHIKIT/CISC7204-Assgn-</w:t>
-        </w:r>
-        <w:r>
-          <w:rPr>
-            <w:rStyle w:val="Hyperlink"/>
-            <w:rFonts w:ascii="Calibri" w:eastAsiaTheme="minorEastAsia" w:hAnsi="Calibri" w:cstheme="minorBidi"/>
-            <w:b w:val="0"/>
-            <w:bCs w:val="0"/>
-            <w:sz w:val="22"/>
-            <w:szCs w:val="22"/>
-          </w:rPr>
-          <w:t>0</w:t>
-        </w:r>
-        <w:r>
-          <w:rPr>
-            <w:rStyle w:val="Hyperlink"/>
-            <w:rFonts w:ascii="Calibri" w:eastAsiaTheme="minorEastAsia" w:hAnsi="Calibri" w:cstheme="minorBidi"/>
-            <w:b w:val="0"/>
-            <w:bCs w:val="0"/>
-            <w:sz w:val="22"/>
-            <w:szCs w:val="22"/>
-          </w:rPr>
-          <w:t>2.git</w:t>
+          <w:t>https://github.com/UNCHIKIT/CISC7204-Assgn-02.git</w:t>
         </w:r>
       </w:hyperlink>
     </w:p>

</xml_diff>